<commit_message>
feat: Adjacency Workbook v1.1 — measure the prize before assessing the path
Zook's third test asks for a path to leadership economics but never asks
whether leadership in that market earns anything. Step 8 now measures
first: leaders' return spread (ROIC-WACC, or RoTE-CoE for financial
businesses), five-year share stability, fade direction, and the
market-implied advantage period where a listed pure-play exists — with
the pairing rules that make the two headline measures readable together.

Uncomputable figures must be marked UNMEASURED rather than narrated,
which is the failure the rule exists to stop: business-unit returns
inside a diversified group are distorted by transfer pricing and shared
costs. Lint rule A13. Sources added to the method section: Greenwald,
Competition Demystified; Mauboussin & Callahan, Measuring the Moat.

Co-Authored-By: Claude Fable 5 <noreply@anthropic.com>
</commit_message>
<xml_diff>
--- a/Profit_Pool_Adjacency_Workbook.docx
+++ b/Profit_Pool_Adjacency_Workbook.docx
@@ -29,7 +29,7 @@
           <w:sz w:val="19"/>
           <w:szCs w:val="19"/>
         </w:rPr>
-        <w:t xml:space="preserve">v1 — in Simplified Technical English. One core business, one pass through this workbook. Output: a profit pool map, a screened adjacency programme, and a refuse-to-play list.</w:t>
+        <w:t xml:space="preserve">v1.1 — Step 8 now measures the prize before assessing the path (leaders' return spread, share stability, fade, implied advantage period); lint rule A13. v1 — first release. In Simplified Technical English. One core business, one pass through this workbook. Output: a profit pool map, a screened adjacency programme, and a refuse-to-play list.</w:t>
       </w:r>
     </w:p>
     <w:p>
@@ -38,7 +38,7 @@
         <w:spacing w:after="160" w:before="320"/>
       </w:pPr>
       <w:r>
-        <w:t xml:space="preserve">The method — three sources, two amendments</w:t>
+        <w:t xml:space="preserve">The method — the spine and its amendments</w:t>
       </w:r>
     </w:p>
     <w:p>
@@ -84,6 +84,21 @@
       </w:r>
       <w:r>
         <w:t xml:space="preserve">(Core Competence, HBR 1990): mature players usually already own adjacent businesses. The win condition is then not entry — it is connecting competencies that business-unit walls separate. Owned but unwired assets are a collection, not a strategy.</w:t>
+      </w:r>
+    </w:p>
+    <w:p>
+      <w:pPr>
+        <w:spacing w:after="120"/>
+      </w:pPr>
+      <w:r>
+        <w:rPr>
+          <w:b/>
+          <w:bCs/>
+        </w:rPr>
+        <w:t xml:space="preserve">Amendment 3 — "leadership economics" must be measured, not asserted. </w:t>
+      </w:r>
+      <w:r>
+        <w:t xml:space="preserve">Zook's third test asks for a path to leadership economics but does not say how to know whether leadership in that market is worth having. Two measures answer it: Greenwald's share-stability test (Competition Demystified, 2005) and the return-spread-and-fade discipline in Mauboussin &amp; Callahan's Measuring the Moat (2016). Step 8 runs both before the five questions.</w:t>
       </w:r>
     </w:p>
     <w:p>
@@ -374,7 +389,7 @@
                 <w:sz w:val="20"/>
                 <w:szCs w:val="20"/>
               </w:rPr>
-              <w:t xml:space="preserve">5. End your reply with SELF-CHECK: list the lint rules (A1-A12) this step can break, and give pass or fail for each.</w:t>
+              <w:t xml:space="preserve">5. End your reply with SELF-CHECK: list the lint rules (A1-A13) this step can break, and give pass or fail for each.</w:t>
             </w:r>
           </w:p>
         </w:tc>
@@ -414,7 +429,7 @@
         <w:t xml:space="preserve">1. Self-check — same chat. </w:t>
       </w:r>
       <w:r>
-        <w:t xml:space="preserve">The SELF-CHECK line makes Copilot lint its own output against A1-A12 at the end of every step.</w:t>
+        <w:t xml:space="preserve">The SELF-CHECK line makes Copilot lint its own output against A1-A13 at the end of every step.</w:t>
       </w:r>
     </w:p>
     <w:p>
@@ -429,7 +444,7 @@
         <w:t xml:space="preserve">2. Independent check — new chat. </w:t>
       </w:r>
       <w:r>
-        <w:t xml:space="preserve">For the final programme, open a new chat, attach this workbook and the filled tables, and write: "Run lint rules A1-A12 on this adjacency analysis. Report each failure by rule number."</w:t>
+        <w:t xml:space="preserve">For the final programme, open a new chat, attach this workbook and the filled tables, and write: "Run lint rules A1-A13 on this adjacency analysis. Report each failure by rule number."</w:t>
       </w:r>
     </w:p>
     <w:p>
@@ -6290,7 +6305,7 @@
           <w:sz w:val="19"/>
           <w:szCs w:val="19"/>
         </w:rPr>
-        <w:t xml:space="preserve">Input: shortlist (Step 7)   Output: per-candidate screen with verdict</w:t>
+        <w:t xml:space="preserve">Input: shortlist (Step 7)   Output: measured prize + per-candidate screen with verdict</w:t>
       </w:r>
     </w:p>
     <w:p>
@@ -6299,7 +6314,15 @@
         <w:spacing w:after="100" w:before="200"/>
       </w:pPr>
       <w:r>
-        <w:t xml:space="preserve">Copilot procedure — run all five questions per candidate</w:t>
+        <w:t xml:space="preserve">First measure the prize — is leadership here worth having, and does it stay won?</w:t>
+      </w:r>
+    </w:p>
+    <w:p>
+      <w:pPr>
+        <w:spacing w:after="120"/>
+      </w:pPr>
+      <w:r>
+        <w:t xml:space="preserve">Zook's third test asks for a path to leadership economics. It does not ask whether leadership in this market earns anything. Some markets have leaders who beat nobody's cost of capital: the position is real and the prize is empty. Measure before you assess the path (A13).</w:t>
       </w:r>
     </w:p>
     <w:p>
@@ -6316,10 +6339,10 @@
           <w:b/>
           <w:bCs/>
         </w:rPr>
-        <w:t xml:space="preserve">Structure: </w:t>
-      </w:r>
-      <w:r>
-        <w:t xml:space="preserve">who leads today, how concentrated, and is the realistic prize the whole market or a definable segment?</w:t>
+        <w:t xml:space="preserve">Return spread of today's leaders. </w:t>
+      </w:r>
+      <w:r>
+        <w:t xml:space="preserve">ROIC minus WACC for the leading players in the adjacent market. For financial businesses use return on tangible equity minus cost of equity — regulatory capital makes ROIC unstable. No spread among the leaders means leadership is not worth winning, and the candidate fails here whatever the narrative says.</w:t>
       </w:r>
     </w:p>
     <w:p>
@@ -6336,10 +6359,10 @@
           <w:b/>
           <w:bCs/>
         </w:rPr>
-        <w:t xml:space="preserve">Leadership segment: </w:t>
-      </w:r>
-      <w:r>
-        <w:t xml:space="preserve">name the segment where leadership is realistic. The cleanest kind expands the pool — an unserved end with no incumbent to displace.</w:t>
+        <w:t xml:space="preserve">Share stability. </w:t>
+      </w:r>
+      <w:r>
+        <w:t xml:space="preserve">Average absolute year-on-year change in share among the top players over five years. Low change means real barriers; high churn means a contested market where no position holds. Read it with the spread: stability plus spread is a defensible prize · stability without spread is a barrier protecting nothing worth having · spread without stability is temporary and probably fading.</w:t>
       </w:r>
     </w:p>
     <w:p>
@@ -6356,10 +6379,10 @@
           <w:b/>
           <w:bCs/>
         </w:rPr>
-        <w:t xml:space="preserve">Path: </w:t>
-      </w:r>
-      <w:r>
-        <w:t xml:space="preserve">which structural advantages convert into leadership — cost position, differentiation, distribution? A me-too share is a FAIL.</w:t>
+        <w:t xml:space="preserve">Fade. </w:t>
+      </w:r>
+      <w:r>
+        <w:t xml:space="preserve">How long have the leaders held the spread, and is it widening or narrowing? Most excess returns decay toward the cost of capital, so a durable spread is the exception and must be evidenced, not assumed.</w:t>
       </w:r>
     </w:p>
     <w:p>
@@ -6376,10 +6399,10 @@
           <w:b/>
           <w:bCs/>
         </w:rPr>
-        <w:t xml:space="preserve">Core effect: </w:t>
-      </w:r>
-      <w:r>
-        <w:t xml:space="preserve">does the move strengthen the core or tax it? Strengthening beats standalone economics.</w:t>
+        <w:t xml:space="preserve">Market-implied advantage period, where a listed pure-play exists. </w:t>
+      </w:r>
+      <w:r>
+        <w:t xml:space="preserve">Reverse-engineer from the share price how many years of excess return the market is pricing in. It reads the durability assumption out of a traded number instead of asserting one. Skip it where the comparators are private or are conglomerates — and say you skipped it.</w:t>
       </w:r>
     </w:p>
     <w:p>
@@ -6388,6 +6411,1320 @@
         <w:numPr>
           <w:ilvl w:val="0"/>
           <w:numId w:val="10"/>
+        </w:numPr>
+        <w:spacing w:after="80"/>
+      </w:pPr>
+      <w:r>
+        <w:rPr>
+          <w:b/>
+          <w:bCs/>
+        </w:rPr>
+        <w:t xml:space="preserve">Record what you could not compute. </w:t>
+      </w:r>
+      <w:r>
+        <w:t xml:space="preserve">Business-unit returns inside a diversified group are distorted by transfer pricing and shared-cost allocation. Where a figure is not computable, write UNMEASURED. Do not substitute a narrative for a number you could not get (A13).</w:t>
+      </w:r>
+    </w:p>
+    <w:tbl>
+      <w:tblPr>
+        <w:tblW w:type="dxa" w:w="9026"/>
+        <w:tblBorders>
+          <w:top w:val="single" w:color="auto" w:sz="4"/>
+          <w:left w:val="single" w:color="auto" w:sz="4"/>
+          <w:bottom w:val="single" w:color="auto" w:sz="4"/>
+          <w:right w:val="single" w:color="auto" w:sz="4"/>
+          <w:insideH w:val="single" w:color="auto" w:sz="4"/>
+          <w:insideV w:val="single" w:color="auto" w:sz="4"/>
+        </w:tblBorders>
+      </w:tblPr>
+      <w:tblGrid>
+        <w:gridCol w:w="9026"/>
+      </w:tblGrid>
+      <w:tr>
+        <w:tc>
+          <w:tcPr>
+            <w:tcW w:type="dxa" w:w="9026"/>
+            <w:tcBorders>
+              <w:top w:val="single" w:color="B0B8C4" w:sz="4"/>
+              <w:left w:val="single" w:color="B0B8C4" w:sz="4"/>
+              <w:bottom w:val="single" w:color="B0B8C4" w:sz="4"/>
+              <w:right w:val="single" w:color="B0B8C4" w:sz="4"/>
+            </w:tcBorders>
+            <w:shd w:fill="F1F3F5" w:val="clear"/>
+            <w:tcMar>
+              <w:top w:type="dxa" w:w="140"/>
+              <w:left w:type="dxa" w:w="180"/>
+              <w:bottom w:type="dxa" w:w="140"/>
+              <w:right w:type="dxa" w:w="180"/>
+            </w:tcMar>
+          </w:tcPr>
+          <w:p>
+            <w:pPr>
+              <w:spacing w:after="100"/>
+            </w:pPr>
+            <w:r>
+              <w:rPr>
+                <w:b/>
+                <w:bCs/>
+                <w:sz w:val="20"/>
+                <w:szCs w:val="20"/>
+              </w:rPr>
+              <w:t xml:space="preserve">PROMPT FOR COPILOT — copy</w:t>
+            </w:r>
+          </w:p>
+          <w:p>
+            <w:pPr>
+              <w:spacing w:after="40"/>
+            </w:pPr>
+            <w:r>
+              <w:rPr>
+                <w:rFonts w:ascii="Consolas" w:cs="Consolas" w:eastAsia="Consolas" w:hAnsi="Consolas"/>
+                <w:sz w:val="20"/>
+                <w:szCs w:val="20"/>
+              </w:rPr>
+              <w:t xml:space="preserve">[paste session state header]</w:t>
+            </w:r>
+          </w:p>
+          <w:p>
+            <w:pPr>
+              <w:spacing w:after="40"/>
+            </w:pPr>
+            <w:r>
+              <w:rPr>
+                <w:rFonts w:ascii="Consolas" w:cs="Consolas" w:eastAsia="Consolas" w:hAnsi="Consolas"/>
+                <w:sz w:val="20"/>
+                <w:szCs w:val="20"/>
+              </w:rPr>
+              <w:t xml:space="preserve">STEP 8 — MEASUREMENT. For each shortlisted market: return spread of the leaders (ROIC-WACC, or RoTE-CoE for financial businesses), five-year share stability, direction of fade, and market-implied advantage period where a listed pure-play exists. Mark every figure VERIFIED / ANCHORED / UNVERIFIED with source and year, and mark UNMEASURED where it cannot be computed. State what the pairing of spread and stability implies for each market.</w:t>
+            </w:r>
+          </w:p>
+        </w:tc>
+      </w:tr>
+    </w:tbl>
+    <w:p>
+      <w:pPr>
+        <w:spacing w:after="80"/>
+      </w:pPr>
+    </w:p>
+    <w:tbl>
+      <w:tblPr>
+        <w:tblW w:type="dxa" w:w="9026"/>
+        <w:tblBorders>
+          <w:top w:val="single" w:color="auto" w:sz="4"/>
+          <w:left w:val="single" w:color="auto" w:sz="4"/>
+          <w:bottom w:val="single" w:color="auto" w:sz="4"/>
+          <w:right w:val="single" w:color="auto" w:sz="4"/>
+          <w:insideH w:val="single" w:color="auto" w:sz="4"/>
+          <w:insideV w:val="single" w:color="auto" w:sz="4"/>
+        </w:tblBorders>
+      </w:tblPr>
+      <w:tblGrid>
+        <w:gridCol w:w="9026"/>
+      </w:tblGrid>
+      <w:tr>
+        <w:tc>
+          <w:tcPr>
+            <w:tcW w:type="dxa" w:w="9026"/>
+            <w:tcBorders>
+              <w:top w:val="single" w:color="B0B8C4" w:sz="4"/>
+              <w:left w:val="single" w:color="B0B8C4" w:sz="4"/>
+              <w:bottom w:val="single" w:color="B0B8C4" w:sz="4"/>
+              <w:right w:val="single" w:color="B0B8C4" w:sz="4"/>
+            </w:tcBorders>
+            <w:shd w:fill="FEF9E6" w:val="clear"/>
+            <w:tcMar>
+              <w:top w:type="dxa" w:w="140"/>
+              <w:left w:type="dxa" w:w="180"/>
+              <w:bottom w:type="dxa" w:w="140"/>
+              <w:right w:type="dxa" w:w="180"/>
+            </w:tcMar>
+          </w:tcPr>
+          <w:p>
+            <w:pPr>
+              <w:spacing w:after="100"/>
+            </w:pPr>
+            <w:r>
+              <w:rPr>
+                <w:b/>
+                <w:bCs/>
+                <w:sz w:val="20"/>
+                <w:szCs w:val="20"/>
+              </w:rPr>
+              <w:t xml:space="preserve">REFERENCE EXAMPLE</w:t>
+            </w:r>
+          </w:p>
+          <w:p>
+            <w:pPr>
+              <w:spacing w:after="40"/>
+            </w:pPr>
+            <w:r>
+              <w:rPr>
+                <w:sz w:val="20"/>
+                <w:szCs w:val="20"/>
+              </w:rPr>
+              <w:t xml:space="preserve">Stability + spread → a defensible prize; enter if the path holds.</w:t>
+            </w:r>
+          </w:p>
+          <w:p>
+            <w:pPr>
+              <w:spacing w:after="40"/>
+            </w:pPr>
+            <w:r>
+              <w:rPr>
+                <w:sz w:val="20"/>
+                <w:szCs w:val="20"/>
+              </w:rPr>
+              <w:t xml:space="preserve">Stability + no spread → the barrier protects an empty pool; the market looks safe and pays nothing.</w:t>
+            </w:r>
+          </w:p>
+          <w:p>
+            <w:pPr>
+              <w:spacing w:after="40"/>
+            </w:pPr>
+            <w:r>
+              <w:rPr>
+                <w:sz w:val="20"/>
+                <w:szCs w:val="20"/>
+              </w:rPr>
+              <w:t xml:space="preserve">Spread + no stability → someone is earning today and will not be for long; entry buys a fading position.</w:t>
+            </w:r>
+          </w:p>
+        </w:tc>
+      </w:tr>
+    </w:tbl>
+    <w:p>
+      <w:pPr>
+        <w:spacing w:after="80"/>
+      </w:pPr>
+    </w:p>
+    <w:tbl>
+      <w:tblPr>
+        <w:tblW w:type="dxa" w:w="9026"/>
+        <w:tblBorders>
+          <w:top w:val="single" w:color="auto" w:sz="4"/>
+          <w:left w:val="single" w:color="auto" w:sz="4"/>
+          <w:bottom w:val="single" w:color="auto" w:sz="4"/>
+          <w:right w:val="single" w:color="auto" w:sz="4"/>
+          <w:insideH w:val="single" w:color="auto" w:sz="4"/>
+          <w:insideV w:val="single" w:color="auto" w:sz="4"/>
+        </w:tblBorders>
+      </w:tblPr>
+      <w:tblGrid>
+        <w:gridCol w:w="9026"/>
+      </w:tblGrid>
+      <w:tr>
+        <w:tc>
+          <w:tcPr>
+            <w:tcW w:type="dxa" w:w="9026"/>
+            <w:tcBorders>
+              <w:top w:val="single" w:color="B0B8C4" w:sz="4"/>
+              <w:left w:val="single" w:color="B0B8C4" w:sz="4"/>
+              <w:bottom w:val="single" w:color="B0B8C4" w:sz="4"/>
+              <w:right w:val="single" w:color="B0B8C4" w:sz="4"/>
+            </w:tcBorders>
+            <w:shd w:fill="E8EEF8" w:val="clear"/>
+            <w:tcMar>
+              <w:top w:type="dxa" w:w="140"/>
+              <w:left w:type="dxa" w:w="180"/>
+              <w:bottom w:type="dxa" w:w="140"/>
+              <w:right w:type="dxa" w:w="180"/>
+            </w:tcMar>
+          </w:tcPr>
+          <w:p>
+            <w:pPr>
+              <w:spacing w:after="100"/>
+            </w:pPr>
+            <w:r>
+              <w:rPr>
+                <w:b/>
+                <w:bCs/>
+                <w:sz w:val="20"/>
+                <w:szCs w:val="20"/>
+              </w:rPr>
+              <w:t xml:space="preserve">YOUR REVIEW CHECKLIST</w:t>
+            </w:r>
+          </w:p>
+          <w:p>
+            <w:pPr>
+              <w:spacing w:after="40"/>
+            </w:pPr>
+            <w:r>
+              <w:rPr>
+                <w:sz w:val="20"/>
+                <w:szCs w:val="20"/>
+              </w:rPr>
+              <w:t xml:space="preserve">☐  Leaders' return spread is measured, not assumed (A13).</w:t>
+            </w:r>
+          </w:p>
+          <w:p>
+            <w:pPr>
+              <w:spacing w:after="40"/>
+            </w:pPr>
+            <w:r>
+              <w:rPr>
+                <w:sz w:val="20"/>
+                <w:szCs w:val="20"/>
+              </w:rPr>
+              <w:t xml:space="preserve">☐  Share stability covers five years and the top players.</w:t>
+            </w:r>
+          </w:p>
+          <w:p>
+            <w:pPr>
+              <w:spacing w:after="40"/>
+            </w:pPr>
+            <w:r>
+              <w:rPr>
+                <w:sz w:val="20"/>
+                <w:szCs w:val="20"/>
+              </w:rPr>
+              <w:t xml:space="preserve">☐  Anything uncomputable is marked UNMEASURED rather than narrated (A13).</w:t>
+            </w:r>
+          </w:p>
+        </w:tc>
+      </w:tr>
+    </w:tbl>
+    <w:p>
+      <w:pPr>
+        <w:spacing w:after="80"/>
+      </w:pPr>
+    </w:p>
+    <w:tbl>
+      <w:tblPr>
+        <w:tblW w:type="dxa" w:w="9026"/>
+        <w:tblBorders>
+          <w:top w:val="single" w:color="auto" w:sz="4"/>
+          <w:left w:val="single" w:color="auto" w:sz="4"/>
+          <w:bottom w:val="single" w:color="auto" w:sz="4"/>
+          <w:right w:val="single" w:color="auto" w:sz="4"/>
+          <w:insideH w:val="single" w:color="auto" w:sz="4"/>
+          <w:insideV w:val="single" w:color="auto" w:sz="4"/>
+        </w:tblBorders>
+      </w:tblPr>
+      <w:tblGrid>
+        <w:gridCol w:w="1600"/>
+        <w:gridCol w:w="1700"/>
+        <w:gridCol w:w="1400"/>
+        <w:gridCol w:w="1300"/>
+        <w:gridCol w:w="1400"/>
+        <w:gridCol w:w="1626"/>
+      </w:tblGrid>
+      <w:tr>
+        <w:tc>
+          <w:tcPr>
+            <w:tcW w:type="dxa" w:w="1600"/>
+            <w:tcBorders>
+              <w:top w:val="single" w:color="B0B8C4" w:sz="4"/>
+              <w:left w:val="single" w:color="B0B8C4" w:sz="4"/>
+              <w:bottom w:val="single" w:color="B0B8C4" w:sz="4"/>
+              <w:right w:val="single" w:color="B0B8C4" w:sz="4"/>
+            </w:tcBorders>
+            <w:shd w:fill="DDE1E7" w:val="clear"/>
+            <w:tcMar>
+              <w:top w:type="dxa" w:w="60"/>
+              <w:left w:type="dxa" w:w="100"/>
+              <w:bottom w:type="dxa" w:w="60"/>
+              <w:right w:type="dxa" w:w="100"/>
+            </w:tcMar>
+          </w:tcPr>
+          <w:p>
+            <w:r>
+              <w:rPr>
+                <w:b/>
+                <w:bCs/>
+                <w:i w:val="false"/>
+                <w:iCs w:val="false"/>
+                <w:sz w:val="20"/>
+                <w:szCs w:val="20"/>
+              </w:rPr>
+              <w:t xml:space="preserve">Market / candidate</w:t>
+            </w:r>
+          </w:p>
+        </w:tc>
+        <w:tc>
+          <w:tcPr>
+            <w:tcW w:type="dxa" w:w="1700"/>
+            <w:tcBorders>
+              <w:top w:val="single" w:color="B0B8C4" w:sz="4"/>
+              <w:left w:val="single" w:color="B0B8C4" w:sz="4"/>
+              <w:bottom w:val="single" w:color="B0B8C4" w:sz="4"/>
+              <w:right w:val="single" w:color="B0B8C4" w:sz="4"/>
+            </w:tcBorders>
+            <w:shd w:fill="DDE1E7" w:val="clear"/>
+            <w:tcMar>
+              <w:top w:type="dxa" w:w="60"/>
+              <w:left w:type="dxa" w:w="100"/>
+              <w:bottom w:type="dxa" w:w="60"/>
+              <w:right w:type="dxa" w:w="100"/>
+            </w:tcMar>
+          </w:tcPr>
+          <w:p>
+            <w:r>
+              <w:rPr>
+                <w:b/>
+                <w:bCs/>
+                <w:i w:val="false"/>
+                <w:iCs w:val="false"/>
+                <w:sz w:val="20"/>
+                <w:szCs w:val="20"/>
+              </w:rPr>
+              <w:t xml:space="preserve">Leaders' return spread (status)</w:t>
+            </w:r>
+          </w:p>
+        </w:tc>
+        <w:tc>
+          <w:tcPr>
+            <w:tcW w:type="dxa" w:w="1400"/>
+            <w:tcBorders>
+              <w:top w:val="single" w:color="B0B8C4" w:sz="4"/>
+              <w:left w:val="single" w:color="B0B8C4" w:sz="4"/>
+              <w:bottom w:val="single" w:color="B0B8C4" w:sz="4"/>
+              <w:right w:val="single" w:color="B0B8C4" w:sz="4"/>
+            </w:tcBorders>
+            <w:shd w:fill="DDE1E7" w:val="clear"/>
+            <w:tcMar>
+              <w:top w:type="dxa" w:w="60"/>
+              <w:left w:type="dxa" w:w="100"/>
+              <w:bottom w:type="dxa" w:w="60"/>
+              <w:right w:type="dxa" w:w="100"/>
+            </w:tcMar>
+          </w:tcPr>
+          <w:p>
+            <w:r>
+              <w:rPr>
+                <w:b/>
+                <w:bCs/>
+                <w:i w:val="false"/>
+                <w:iCs w:val="false"/>
+                <w:sz w:val="20"/>
+                <w:szCs w:val="20"/>
+              </w:rPr>
+              <w:t xml:space="preserve">Share stability (5yr)</w:t>
+            </w:r>
+          </w:p>
+        </w:tc>
+        <w:tc>
+          <w:tcPr>
+            <w:tcW w:type="dxa" w:w="1300"/>
+            <w:tcBorders>
+              <w:top w:val="single" w:color="B0B8C4" w:sz="4"/>
+              <w:left w:val="single" w:color="B0B8C4" w:sz="4"/>
+              <w:bottom w:val="single" w:color="B0B8C4" w:sz="4"/>
+              <w:right w:val="single" w:color="B0B8C4" w:sz="4"/>
+            </w:tcBorders>
+            <w:shd w:fill="DDE1E7" w:val="clear"/>
+            <w:tcMar>
+              <w:top w:type="dxa" w:w="60"/>
+              <w:left w:type="dxa" w:w="100"/>
+              <w:bottom w:type="dxa" w:w="60"/>
+              <w:right w:type="dxa" w:w="100"/>
+            </w:tcMar>
+          </w:tcPr>
+          <w:p>
+            <w:r>
+              <w:rPr>
+                <w:b/>
+                <w:bCs/>
+                <w:i w:val="false"/>
+                <w:iCs w:val="false"/>
+                <w:sz w:val="20"/>
+                <w:szCs w:val="20"/>
+              </w:rPr>
+              <w:t xml:space="preserve">Fade direction</w:t>
+            </w:r>
+          </w:p>
+        </w:tc>
+        <w:tc>
+          <w:tcPr>
+            <w:tcW w:type="dxa" w:w="1400"/>
+            <w:tcBorders>
+              <w:top w:val="single" w:color="B0B8C4" w:sz="4"/>
+              <w:left w:val="single" w:color="B0B8C4" w:sz="4"/>
+              <w:bottom w:val="single" w:color="B0B8C4" w:sz="4"/>
+              <w:right w:val="single" w:color="B0B8C4" w:sz="4"/>
+            </w:tcBorders>
+            <w:shd w:fill="DDE1E7" w:val="clear"/>
+            <w:tcMar>
+              <w:top w:type="dxa" w:w="60"/>
+              <w:left w:type="dxa" w:w="100"/>
+              <w:bottom w:type="dxa" w:w="60"/>
+              <w:right w:type="dxa" w:w="100"/>
+            </w:tcMar>
+          </w:tcPr>
+          <w:p>
+            <w:r>
+              <w:rPr>
+                <w:b/>
+                <w:bCs/>
+                <w:i w:val="false"/>
+                <w:iCs w:val="false"/>
+                <w:sz w:val="20"/>
+                <w:szCs w:val="20"/>
+              </w:rPr>
+              <w:t xml:space="preserve">Implied advantage period</w:t>
+            </w:r>
+          </w:p>
+        </w:tc>
+        <w:tc>
+          <w:tcPr>
+            <w:tcW w:type="dxa" w:w="1626"/>
+            <w:tcBorders>
+              <w:top w:val="single" w:color="B0B8C4" w:sz="4"/>
+              <w:left w:val="single" w:color="B0B8C4" w:sz="4"/>
+              <w:bottom w:val="single" w:color="B0B8C4" w:sz="4"/>
+              <w:right w:val="single" w:color="B0B8C4" w:sz="4"/>
+            </w:tcBorders>
+            <w:shd w:fill="DDE1E7" w:val="clear"/>
+            <w:tcMar>
+              <w:top w:type="dxa" w:w="60"/>
+              <w:left w:type="dxa" w:w="100"/>
+              <w:bottom w:type="dxa" w:w="60"/>
+              <w:right w:type="dxa" w:w="100"/>
+            </w:tcMar>
+          </w:tcPr>
+          <w:p>
+            <w:r>
+              <w:rPr>
+                <w:b/>
+                <w:bCs/>
+                <w:i w:val="false"/>
+                <w:iCs w:val="false"/>
+                <w:sz w:val="20"/>
+                <w:szCs w:val="20"/>
+              </w:rPr>
+              <w:t xml:space="preserve">What the pairing implies</w:t>
+            </w:r>
+          </w:p>
+        </w:tc>
+      </w:tr>
+      <w:tr>
+        <w:tc>
+          <w:tcPr>
+            <w:tcW w:type="dxa" w:w="1600"/>
+            <w:tcBorders>
+              <w:top w:val="single" w:color="B0B8C4" w:sz="4"/>
+              <w:left w:val="single" w:color="B0B8C4" w:sz="4"/>
+              <w:bottom w:val="single" w:color="B0B8C4" w:sz="4"/>
+              <w:right w:val="single" w:color="B0B8C4" w:sz="4"/>
+            </w:tcBorders>
+            <w:tcMar>
+              <w:top w:type="dxa" w:w="60"/>
+              <w:left w:type="dxa" w:w="100"/>
+              <w:bottom w:type="dxa" w:w="60"/>
+              <w:right w:type="dxa" w:w="100"/>
+            </w:tcMar>
+          </w:tcPr>
+          <w:p>
+            <w:r>
+              <w:rPr>
+                <w:b w:val="false"/>
+                <w:bCs w:val="false"/>
+                <w:i w:val="false"/>
+                <w:iCs w:val="false"/>
+                <w:sz w:val="20"/>
+                <w:szCs w:val="20"/>
+              </w:rPr>
+              <w:t xml:space="preserve"/>
+            </w:r>
+          </w:p>
+        </w:tc>
+        <w:tc>
+          <w:tcPr>
+            <w:tcW w:type="dxa" w:w="1700"/>
+            <w:tcBorders>
+              <w:top w:val="single" w:color="B0B8C4" w:sz="4"/>
+              <w:left w:val="single" w:color="B0B8C4" w:sz="4"/>
+              <w:bottom w:val="single" w:color="B0B8C4" w:sz="4"/>
+              <w:right w:val="single" w:color="B0B8C4" w:sz="4"/>
+            </w:tcBorders>
+            <w:tcMar>
+              <w:top w:type="dxa" w:w="60"/>
+              <w:left w:type="dxa" w:w="100"/>
+              <w:bottom w:type="dxa" w:w="60"/>
+              <w:right w:type="dxa" w:w="100"/>
+            </w:tcMar>
+          </w:tcPr>
+          <w:p>
+            <w:r>
+              <w:rPr>
+                <w:b w:val="false"/>
+                <w:bCs w:val="false"/>
+                <w:i w:val="false"/>
+                <w:iCs w:val="false"/>
+                <w:sz w:val="20"/>
+                <w:szCs w:val="20"/>
+              </w:rPr>
+              <w:t xml:space="preserve"/>
+            </w:r>
+          </w:p>
+        </w:tc>
+        <w:tc>
+          <w:tcPr>
+            <w:tcW w:type="dxa" w:w="1400"/>
+            <w:tcBorders>
+              <w:top w:val="single" w:color="B0B8C4" w:sz="4"/>
+              <w:left w:val="single" w:color="B0B8C4" w:sz="4"/>
+              <w:bottom w:val="single" w:color="B0B8C4" w:sz="4"/>
+              <w:right w:val="single" w:color="B0B8C4" w:sz="4"/>
+            </w:tcBorders>
+            <w:tcMar>
+              <w:top w:type="dxa" w:w="60"/>
+              <w:left w:type="dxa" w:w="100"/>
+              <w:bottom w:type="dxa" w:w="60"/>
+              <w:right w:type="dxa" w:w="100"/>
+            </w:tcMar>
+          </w:tcPr>
+          <w:p>
+            <w:r>
+              <w:rPr>
+                <w:b w:val="false"/>
+                <w:bCs w:val="false"/>
+                <w:i w:val="false"/>
+                <w:iCs w:val="false"/>
+                <w:sz w:val="20"/>
+                <w:szCs w:val="20"/>
+              </w:rPr>
+              <w:t xml:space="preserve"/>
+            </w:r>
+          </w:p>
+        </w:tc>
+        <w:tc>
+          <w:tcPr>
+            <w:tcW w:type="dxa" w:w="1300"/>
+            <w:tcBorders>
+              <w:top w:val="single" w:color="B0B8C4" w:sz="4"/>
+              <w:left w:val="single" w:color="B0B8C4" w:sz="4"/>
+              <w:bottom w:val="single" w:color="B0B8C4" w:sz="4"/>
+              <w:right w:val="single" w:color="B0B8C4" w:sz="4"/>
+            </w:tcBorders>
+            <w:tcMar>
+              <w:top w:type="dxa" w:w="60"/>
+              <w:left w:type="dxa" w:w="100"/>
+              <w:bottom w:type="dxa" w:w="60"/>
+              <w:right w:type="dxa" w:w="100"/>
+            </w:tcMar>
+          </w:tcPr>
+          <w:p>
+            <w:r>
+              <w:rPr>
+                <w:b w:val="false"/>
+                <w:bCs w:val="false"/>
+                <w:i w:val="false"/>
+                <w:iCs w:val="false"/>
+                <w:sz w:val="20"/>
+                <w:szCs w:val="20"/>
+              </w:rPr>
+              <w:t xml:space="preserve"/>
+            </w:r>
+          </w:p>
+        </w:tc>
+        <w:tc>
+          <w:tcPr>
+            <w:tcW w:type="dxa" w:w="1400"/>
+            <w:tcBorders>
+              <w:top w:val="single" w:color="B0B8C4" w:sz="4"/>
+              <w:left w:val="single" w:color="B0B8C4" w:sz="4"/>
+              <w:bottom w:val="single" w:color="B0B8C4" w:sz="4"/>
+              <w:right w:val="single" w:color="B0B8C4" w:sz="4"/>
+            </w:tcBorders>
+            <w:tcMar>
+              <w:top w:type="dxa" w:w="60"/>
+              <w:left w:type="dxa" w:w="100"/>
+              <w:bottom w:type="dxa" w:w="60"/>
+              <w:right w:type="dxa" w:w="100"/>
+            </w:tcMar>
+          </w:tcPr>
+          <w:p>
+            <w:r>
+              <w:rPr>
+                <w:b w:val="false"/>
+                <w:bCs w:val="false"/>
+                <w:i w:val="false"/>
+                <w:iCs w:val="false"/>
+                <w:sz w:val="20"/>
+                <w:szCs w:val="20"/>
+              </w:rPr>
+              <w:t xml:space="preserve"/>
+            </w:r>
+          </w:p>
+        </w:tc>
+        <w:tc>
+          <w:tcPr>
+            <w:tcW w:type="dxa" w:w="1626"/>
+            <w:tcBorders>
+              <w:top w:val="single" w:color="B0B8C4" w:sz="4"/>
+              <w:left w:val="single" w:color="B0B8C4" w:sz="4"/>
+              <w:bottom w:val="single" w:color="B0B8C4" w:sz="4"/>
+              <w:right w:val="single" w:color="B0B8C4" w:sz="4"/>
+            </w:tcBorders>
+            <w:tcMar>
+              <w:top w:type="dxa" w:w="60"/>
+              <w:left w:type="dxa" w:w="100"/>
+              <w:bottom w:type="dxa" w:w="60"/>
+              <w:right w:type="dxa" w:w="100"/>
+            </w:tcMar>
+          </w:tcPr>
+          <w:p>
+            <w:r>
+              <w:rPr>
+                <w:b w:val="false"/>
+                <w:bCs w:val="false"/>
+                <w:i w:val="false"/>
+                <w:iCs w:val="false"/>
+                <w:sz w:val="20"/>
+                <w:szCs w:val="20"/>
+              </w:rPr>
+              <w:t xml:space="preserve"/>
+            </w:r>
+          </w:p>
+        </w:tc>
+      </w:tr>
+      <w:tr>
+        <w:tc>
+          <w:tcPr>
+            <w:tcW w:type="dxa" w:w="1600"/>
+            <w:tcBorders>
+              <w:top w:val="single" w:color="B0B8C4" w:sz="4"/>
+              <w:left w:val="single" w:color="B0B8C4" w:sz="4"/>
+              <w:bottom w:val="single" w:color="B0B8C4" w:sz="4"/>
+              <w:right w:val="single" w:color="B0B8C4" w:sz="4"/>
+            </w:tcBorders>
+            <w:tcMar>
+              <w:top w:type="dxa" w:w="60"/>
+              <w:left w:type="dxa" w:w="100"/>
+              <w:bottom w:type="dxa" w:w="60"/>
+              <w:right w:type="dxa" w:w="100"/>
+            </w:tcMar>
+          </w:tcPr>
+          <w:p>
+            <w:r>
+              <w:rPr>
+                <w:b w:val="false"/>
+                <w:bCs w:val="false"/>
+                <w:i w:val="false"/>
+                <w:iCs w:val="false"/>
+                <w:sz w:val="20"/>
+                <w:szCs w:val="20"/>
+              </w:rPr>
+              <w:t xml:space="preserve"/>
+            </w:r>
+          </w:p>
+        </w:tc>
+        <w:tc>
+          <w:tcPr>
+            <w:tcW w:type="dxa" w:w="1700"/>
+            <w:tcBorders>
+              <w:top w:val="single" w:color="B0B8C4" w:sz="4"/>
+              <w:left w:val="single" w:color="B0B8C4" w:sz="4"/>
+              <w:bottom w:val="single" w:color="B0B8C4" w:sz="4"/>
+              <w:right w:val="single" w:color="B0B8C4" w:sz="4"/>
+            </w:tcBorders>
+            <w:tcMar>
+              <w:top w:type="dxa" w:w="60"/>
+              <w:left w:type="dxa" w:w="100"/>
+              <w:bottom w:type="dxa" w:w="60"/>
+              <w:right w:type="dxa" w:w="100"/>
+            </w:tcMar>
+          </w:tcPr>
+          <w:p>
+            <w:r>
+              <w:rPr>
+                <w:b w:val="false"/>
+                <w:bCs w:val="false"/>
+                <w:i w:val="false"/>
+                <w:iCs w:val="false"/>
+                <w:sz w:val="20"/>
+                <w:szCs w:val="20"/>
+              </w:rPr>
+              <w:t xml:space="preserve"/>
+            </w:r>
+          </w:p>
+        </w:tc>
+        <w:tc>
+          <w:tcPr>
+            <w:tcW w:type="dxa" w:w="1400"/>
+            <w:tcBorders>
+              <w:top w:val="single" w:color="B0B8C4" w:sz="4"/>
+              <w:left w:val="single" w:color="B0B8C4" w:sz="4"/>
+              <w:bottom w:val="single" w:color="B0B8C4" w:sz="4"/>
+              <w:right w:val="single" w:color="B0B8C4" w:sz="4"/>
+            </w:tcBorders>
+            <w:tcMar>
+              <w:top w:type="dxa" w:w="60"/>
+              <w:left w:type="dxa" w:w="100"/>
+              <w:bottom w:type="dxa" w:w="60"/>
+              <w:right w:type="dxa" w:w="100"/>
+            </w:tcMar>
+          </w:tcPr>
+          <w:p>
+            <w:r>
+              <w:rPr>
+                <w:b w:val="false"/>
+                <w:bCs w:val="false"/>
+                <w:i w:val="false"/>
+                <w:iCs w:val="false"/>
+                <w:sz w:val="20"/>
+                <w:szCs w:val="20"/>
+              </w:rPr>
+              <w:t xml:space="preserve"/>
+            </w:r>
+          </w:p>
+        </w:tc>
+        <w:tc>
+          <w:tcPr>
+            <w:tcW w:type="dxa" w:w="1300"/>
+            <w:tcBorders>
+              <w:top w:val="single" w:color="B0B8C4" w:sz="4"/>
+              <w:left w:val="single" w:color="B0B8C4" w:sz="4"/>
+              <w:bottom w:val="single" w:color="B0B8C4" w:sz="4"/>
+              <w:right w:val="single" w:color="B0B8C4" w:sz="4"/>
+            </w:tcBorders>
+            <w:tcMar>
+              <w:top w:type="dxa" w:w="60"/>
+              <w:left w:type="dxa" w:w="100"/>
+              <w:bottom w:type="dxa" w:w="60"/>
+              <w:right w:type="dxa" w:w="100"/>
+            </w:tcMar>
+          </w:tcPr>
+          <w:p>
+            <w:r>
+              <w:rPr>
+                <w:b w:val="false"/>
+                <w:bCs w:val="false"/>
+                <w:i w:val="false"/>
+                <w:iCs w:val="false"/>
+                <w:sz w:val="20"/>
+                <w:szCs w:val="20"/>
+              </w:rPr>
+              <w:t xml:space="preserve"/>
+            </w:r>
+          </w:p>
+        </w:tc>
+        <w:tc>
+          <w:tcPr>
+            <w:tcW w:type="dxa" w:w="1400"/>
+            <w:tcBorders>
+              <w:top w:val="single" w:color="B0B8C4" w:sz="4"/>
+              <w:left w:val="single" w:color="B0B8C4" w:sz="4"/>
+              <w:bottom w:val="single" w:color="B0B8C4" w:sz="4"/>
+              <w:right w:val="single" w:color="B0B8C4" w:sz="4"/>
+            </w:tcBorders>
+            <w:tcMar>
+              <w:top w:type="dxa" w:w="60"/>
+              <w:left w:type="dxa" w:w="100"/>
+              <w:bottom w:type="dxa" w:w="60"/>
+              <w:right w:type="dxa" w:w="100"/>
+            </w:tcMar>
+          </w:tcPr>
+          <w:p>
+            <w:r>
+              <w:rPr>
+                <w:b w:val="false"/>
+                <w:bCs w:val="false"/>
+                <w:i w:val="false"/>
+                <w:iCs w:val="false"/>
+                <w:sz w:val="20"/>
+                <w:szCs w:val="20"/>
+              </w:rPr>
+              <w:t xml:space="preserve"/>
+            </w:r>
+          </w:p>
+        </w:tc>
+        <w:tc>
+          <w:tcPr>
+            <w:tcW w:type="dxa" w:w="1626"/>
+            <w:tcBorders>
+              <w:top w:val="single" w:color="B0B8C4" w:sz="4"/>
+              <w:left w:val="single" w:color="B0B8C4" w:sz="4"/>
+              <w:bottom w:val="single" w:color="B0B8C4" w:sz="4"/>
+              <w:right w:val="single" w:color="B0B8C4" w:sz="4"/>
+            </w:tcBorders>
+            <w:tcMar>
+              <w:top w:type="dxa" w:w="60"/>
+              <w:left w:type="dxa" w:w="100"/>
+              <w:bottom w:type="dxa" w:w="60"/>
+              <w:right w:type="dxa" w:w="100"/>
+            </w:tcMar>
+          </w:tcPr>
+          <w:p>
+            <w:r>
+              <w:rPr>
+                <w:b w:val="false"/>
+                <w:bCs w:val="false"/>
+                <w:i w:val="false"/>
+                <w:iCs w:val="false"/>
+                <w:sz w:val="20"/>
+                <w:szCs w:val="20"/>
+              </w:rPr>
+              <w:t xml:space="preserve"/>
+            </w:r>
+          </w:p>
+        </w:tc>
+      </w:tr>
+      <w:tr>
+        <w:tc>
+          <w:tcPr>
+            <w:tcW w:type="dxa" w:w="1600"/>
+            <w:tcBorders>
+              <w:top w:val="single" w:color="B0B8C4" w:sz="4"/>
+              <w:left w:val="single" w:color="B0B8C4" w:sz="4"/>
+              <w:bottom w:val="single" w:color="B0B8C4" w:sz="4"/>
+              <w:right w:val="single" w:color="B0B8C4" w:sz="4"/>
+            </w:tcBorders>
+            <w:tcMar>
+              <w:top w:type="dxa" w:w="60"/>
+              <w:left w:type="dxa" w:w="100"/>
+              <w:bottom w:type="dxa" w:w="60"/>
+              <w:right w:type="dxa" w:w="100"/>
+            </w:tcMar>
+          </w:tcPr>
+          <w:p>
+            <w:r>
+              <w:rPr>
+                <w:b w:val="false"/>
+                <w:bCs w:val="false"/>
+                <w:i w:val="false"/>
+                <w:iCs w:val="false"/>
+                <w:sz w:val="20"/>
+                <w:szCs w:val="20"/>
+              </w:rPr>
+              <w:t xml:space="preserve"/>
+            </w:r>
+          </w:p>
+        </w:tc>
+        <w:tc>
+          <w:tcPr>
+            <w:tcW w:type="dxa" w:w="1700"/>
+            <w:tcBorders>
+              <w:top w:val="single" w:color="B0B8C4" w:sz="4"/>
+              <w:left w:val="single" w:color="B0B8C4" w:sz="4"/>
+              <w:bottom w:val="single" w:color="B0B8C4" w:sz="4"/>
+              <w:right w:val="single" w:color="B0B8C4" w:sz="4"/>
+            </w:tcBorders>
+            <w:tcMar>
+              <w:top w:type="dxa" w:w="60"/>
+              <w:left w:type="dxa" w:w="100"/>
+              <w:bottom w:type="dxa" w:w="60"/>
+              <w:right w:type="dxa" w:w="100"/>
+            </w:tcMar>
+          </w:tcPr>
+          <w:p>
+            <w:r>
+              <w:rPr>
+                <w:b w:val="false"/>
+                <w:bCs w:val="false"/>
+                <w:i w:val="false"/>
+                <w:iCs w:val="false"/>
+                <w:sz w:val="20"/>
+                <w:szCs w:val="20"/>
+              </w:rPr>
+              <w:t xml:space="preserve"/>
+            </w:r>
+          </w:p>
+        </w:tc>
+        <w:tc>
+          <w:tcPr>
+            <w:tcW w:type="dxa" w:w="1400"/>
+            <w:tcBorders>
+              <w:top w:val="single" w:color="B0B8C4" w:sz="4"/>
+              <w:left w:val="single" w:color="B0B8C4" w:sz="4"/>
+              <w:bottom w:val="single" w:color="B0B8C4" w:sz="4"/>
+              <w:right w:val="single" w:color="B0B8C4" w:sz="4"/>
+            </w:tcBorders>
+            <w:tcMar>
+              <w:top w:type="dxa" w:w="60"/>
+              <w:left w:type="dxa" w:w="100"/>
+              <w:bottom w:type="dxa" w:w="60"/>
+              <w:right w:type="dxa" w:w="100"/>
+            </w:tcMar>
+          </w:tcPr>
+          <w:p>
+            <w:r>
+              <w:rPr>
+                <w:b w:val="false"/>
+                <w:bCs w:val="false"/>
+                <w:i w:val="false"/>
+                <w:iCs w:val="false"/>
+                <w:sz w:val="20"/>
+                <w:szCs w:val="20"/>
+              </w:rPr>
+              <w:t xml:space="preserve"/>
+            </w:r>
+          </w:p>
+        </w:tc>
+        <w:tc>
+          <w:tcPr>
+            <w:tcW w:type="dxa" w:w="1300"/>
+            <w:tcBorders>
+              <w:top w:val="single" w:color="B0B8C4" w:sz="4"/>
+              <w:left w:val="single" w:color="B0B8C4" w:sz="4"/>
+              <w:bottom w:val="single" w:color="B0B8C4" w:sz="4"/>
+              <w:right w:val="single" w:color="B0B8C4" w:sz="4"/>
+            </w:tcBorders>
+            <w:tcMar>
+              <w:top w:type="dxa" w:w="60"/>
+              <w:left w:type="dxa" w:w="100"/>
+              <w:bottom w:type="dxa" w:w="60"/>
+              <w:right w:type="dxa" w:w="100"/>
+            </w:tcMar>
+          </w:tcPr>
+          <w:p>
+            <w:r>
+              <w:rPr>
+                <w:b w:val="false"/>
+                <w:bCs w:val="false"/>
+                <w:i w:val="false"/>
+                <w:iCs w:val="false"/>
+                <w:sz w:val="20"/>
+                <w:szCs w:val="20"/>
+              </w:rPr>
+              <w:t xml:space="preserve"/>
+            </w:r>
+          </w:p>
+        </w:tc>
+        <w:tc>
+          <w:tcPr>
+            <w:tcW w:type="dxa" w:w="1400"/>
+            <w:tcBorders>
+              <w:top w:val="single" w:color="B0B8C4" w:sz="4"/>
+              <w:left w:val="single" w:color="B0B8C4" w:sz="4"/>
+              <w:bottom w:val="single" w:color="B0B8C4" w:sz="4"/>
+              <w:right w:val="single" w:color="B0B8C4" w:sz="4"/>
+            </w:tcBorders>
+            <w:tcMar>
+              <w:top w:type="dxa" w:w="60"/>
+              <w:left w:type="dxa" w:w="100"/>
+              <w:bottom w:type="dxa" w:w="60"/>
+              <w:right w:type="dxa" w:w="100"/>
+            </w:tcMar>
+          </w:tcPr>
+          <w:p>
+            <w:r>
+              <w:rPr>
+                <w:b w:val="false"/>
+                <w:bCs w:val="false"/>
+                <w:i w:val="false"/>
+                <w:iCs w:val="false"/>
+                <w:sz w:val="20"/>
+                <w:szCs w:val="20"/>
+              </w:rPr>
+              <w:t xml:space="preserve"/>
+            </w:r>
+          </w:p>
+        </w:tc>
+        <w:tc>
+          <w:tcPr>
+            <w:tcW w:type="dxa" w:w="1626"/>
+            <w:tcBorders>
+              <w:top w:val="single" w:color="B0B8C4" w:sz="4"/>
+              <w:left w:val="single" w:color="B0B8C4" w:sz="4"/>
+              <w:bottom w:val="single" w:color="B0B8C4" w:sz="4"/>
+              <w:right w:val="single" w:color="B0B8C4" w:sz="4"/>
+            </w:tcBorders>
+            <w:tcMar>
+              <w:top w:type="dxa" w:w="60"/>
+              <w:left w:type="dxa" w:w="100"/>
+              <w:bottom w:type="dxa" w:w="60"/>
+              <w:right w:type="dxa" w:w="100"/>
+            </w:tcMar>
+          </w:tcPr>
+          <w:p>
+            <w:r>
+              <w:rPr>
+                <w:b w:val="false"/>
+                <w:bCs w:val="false"/>
+                <w:i w:val="false"/>
+                <w:iCs w:val="false"/>
+                <w:sz w:val="20"/>
+                <w:szCs w:val="20"/>
+              </w:rPr>
+              <w:t xml:space="preserve"/>
+            </w:r>
+          </w:p>
+        </w:tc>
+      </w:tr>
+      <w:tr>
+        <w:tc>
+          <w:tcPr>
+            <w:tcW w:type="dxa" w:w="1600"/>
+            <w:tcBorders>
+              <w:top w:val="single" w:color="B0B8C4" w:sz="4"/>
+              <w:left w:val="single" w:color="B0B8C4" w:sz="4"/>
+              <w:bottom w:val="single" w:color="B0B8C4" w:sz="4"/>
+              <w:right w:val="single" w:color="B0B8C4" w:sz="4"/>
+            </w:tcBorders>
+            <w:tcMar>
+              <w:top w:type="dxa" w:w="60"/>
+              <w:left w:type="dxa" w:w="100"/>
+              <w:bottom w:type="dxa" w:w="60"/>
+              <w:right w:type="dxa" w:w="100"/>
+            </w:tcMar>
+          </w:tcPr>
+          <w:p>
+            <w:r>
+              <w:rPr>
+                <w:b w:val="false"/>
+                <w:bCs w:val="false"/>
+                <w:i w:val="false"/>
+                <w:iCs w:val="false"/>
+                <w:sz w:val="20"/>
+                <w:szCs w:val="20"/>
+              </w:rPr>
+              <w:t xml:space="preserve"/>
+            </w:r>
+          </w:p>
+        </w:tc>
+        <w:tc>
+          <w:tcPr>
+            <w:tcW w:type="dxa" w:w="1700"/>
+            <w:tcBorders>
+              <w:top w:val="single" w:color="B0B8C4" w:sz="4"/>
+              <w:left w:val="single" w:color="B0B8C4" w:sz="4"/>
+              <w:bottom w:val="single" w:color="B0B8C4" w:sz="4"/>
+              <w:right w:val="single" w:color="B0B8C4" w:sz="4"/>
+            </w:tcBorders>
+            <w:tcMar>
+              <w:top w:type="dxa" w:w="60"/>
+              <w:left w:type="dxa" w:w="100"/>
+              <w:bottom w:type="dxa" w:w="60"/>
+              <w:right w:type="dxa" w:w="100"/>
+            </w:tcMar>
+          </w:tcPr>
+          <w:p>
+            <w:r>
+              <w:rPr>
+                <w:b w:val="false"/>
+                <w:bCs w:val="false"/>
+                <w:i w:val="false"/>
+                <w:iCs w:val="false"/>
+                <w:sz w:val="20"/>
+                <w:szCs w:val="20"/>
+              </w:rPr>
+              <w:t xml:space="preserve"/>
+            </w:r>
+          </w:p>
+        </w:tc>
+        <w:tc>
+          <w:tcPr>
+            <w:tcW w:type="dxa" w:w="1400"/>
+            <w:tcBorders>
+              <w:top w:val="single" w:color="B0B8C4" w:sz="4"/>
+              <w:left w:val="single" w:color="B0B8C4" w:sz="4"/>
+              <w:bottom w:val="single" w:color="B0B8C4" w:sz="4"/>
+              <w:right w:val="single" w:color="B0B8C4" w:sz="4"/>
+            </w:tcBorders>
+            <w:tcMar>
+              <w:top w:type="dxa" w:w="60"/>
+              <w:left w:type="dxa" w:w="100"/>
+              <w:bottom w:type="dxa" w:w="60"/>
+              <w:right w:type="dxa" w:w="100"/>
+            </w:tcMar>
+          </w:tcPr>
+          <w:p>
+            <w:r>
+              <w:rPr>
+                <w:b w:val="false"/>
+                <w:bCs w:val="false"/>
+                <w:i w:val="false"/>
+                <w:iCs w:val="false"/>
+                <w:sz w:val="20"/>
+                <w:szCs w:val="20"/>
+              </w:rPr>
+              <w:t xml:space="preserve"/>
+            </w:r>
+          </w:p>
+        </w:tc>
+        <w:tc>
+          <w:tcPr>
+            <w:tcW w:type="dxa" w:w="1300"/>
+            <w:tcBorders>
+              <w:top w:val="single" w:color="B0B8C4" w:sz="4"/>
+              <w:left w:val="single" w:color="B0B8C4" w:sz="4"/>
+              <w:bottom w:val="single" w:color="B0B8C4" w:sz="4"/>
+              <w:right w:val="single" w:color="B0B8C4" w:sz="4"/>
+            </w:tcBorders>
+            <w:tcMar>
+              <w:top w:type="dxa" w:w="60"/>
+              <w:left w:type="dxa" w:w="100"/>
+              <w:bottom w:type="dxa" w:w="60"/>
+              <w:right w:type="dxa" w:w="100"/>
+            </w:tcMar>
+          </w:tcPr>
+          <w:p>
+            <w:r>
+              <w:rPr>
+                <w:b w:val="false"/>
+                <w:bCs w:val="false"/>
+                <w:i w:val="false"/>
+                <w:iCs w:val="false"/>
+                <w:sz w:val="20"/>
+                <w:szCs w:val="20"/>
+              </w:rPr>
+              <w:t xml:space="preserve"/>
+            </w:r>
+          </w:p>
+        </w:tc>
+        <w:tc>
+          <w:tcPr>
+            <w:tcW w:type="dxa" w:w="1400"/>
+            <w:tcBorders>
+              <w:top w:val="single" w:color="B0B8C4" w:sz="4"/>
+              <w:left w:val="single" w:color="B0B8C4" w:sz="4"/>
+              <w:bottom w:val="single" w:color="B0B8C4" w:sz="4"/>
+              <w:right w:val="single" w:color="B0B8C4" w:sz="4"/>
+            </w:tcBorders>
+            <w:tcMar>
+              <w:top w:type="dxa" w:w="60"/>
+              <w:left w:type="dxa" w:w="100"/>
+              <w:bottom w:type="dxa" w:w="60"/>
+              <w:right w:type="dxa" w:w="100"/>
+            </w:tcMar>
+          </w:tcPr>
+          <w:p>
+            <w:r>
+              <w:rPr>
+                <w:b w:val="false"/>
+                <w:bCs w:val="false"/>
+                <w:i w:val="false"/>
+                <w:iCs w:val="false"/>
+                <w:sz w:val="20"/>
+                <w:szCs w:val="20"/>
+              </w:rPr>
+              <w:t xml:space="preserve"/>
+            </w:r>
+          </w:p>
+        </w:tc>
+        <w:tc>
+          <w:tcPr>
+            <w:tcW w:type="dxa" w:w="1626"/>
+            <w:tcBorders>
+              <w:top w:val="single" w:color="B0B8C4" w:sz="4"/>
+              <w:left w:val="single" w:color="B0B8C4" w:sz="4"/>
+              <w:bottom w:val="single" w:color="B0B8C4" w:sz="4"/>
+              <w:right w:val="single" w:color="B0B8C4" w:sz="4"/>
+            </w:tcBorders>
+            <w:tcMar>
+              <w:top w:type="dxa" w:w="60"/>
+              <w:left w:type="dxa" w:w="100"/>
+              <w:bottom w:type="dxa" w:w="60"/>
+              <w:right w:type="dxa" w:w="100"/>
+            </w:tcMar>
+          </w:tcPr>
+          <w:p>
+            <w:r>
+              <w:rPr>
+                <w:b w:val="false"/>
+                <w:bCs w:val="false"/>
+                <w:i w:val="false"/>
+                <w:iCs w:val="false"/>
+                <w:sz w:val="20"/>
+                <w:szCs w:val="20"/>
+              </w:rPr>
+              <w:t xml:space="preserve"/>
+            </w:r>
+          </w:p>
+        </w:tc>
+      </w:tr>
+    </w:tbl>
+    <w:p>
+      <w:pPr>
+        <w:spacing w:after="80"/>
+      </w:pPr>
+    </w:p>
+    <w:p>
+      <w:pPr>
+        <w:pStyle w:val="Heading3"/>
+        <w:spacing w:after="100" w:before="200"/>
+      </w:pPr>
+      <w:r>
+        <w:t xml:space="preserve">Then run all five questions per candidate</w:t>
+      </w:r>
+    </w:p>
+    <w:p>
+      <w:pPr>
+        <w:pStyle w:val="ListParagraph"/>
+        <w:numPr>
+          <w:ilvl w:val="0"/>
+          <w:numId w:val="11"/>
+        </w:numPr>
+        <w:spacing w:after="80"/>
+      </w:pPr>
+      <w:r>
+        <w:rPr>
+          <w:b/>
+          <w:bCs/>
+        </w:rPr>
+        <w:t xml:space="preserve">Structure: </w:t>
+      </w:r>
+      <w:r>
+        <w:t xml:space="preserve">who leads today, how concentrated, and is the realistic prize the whole market or a definable segment?</w:t>
+      </w:r>
+    </w:p>
+    <w:p>
+      <w:pPr>
+        <w:pStyle w:val="ListParagraph"/>
+        <w:numPr>
+          <w:ilvl w:val="0"/>
+          <w:numId w:val="11"/>
+        </w:numPr>
+        <w:spacing w:after="80"/>
+      </w:pPr>
+      <w:r>
+        <w:rPr>
+          <w:b/>
+          <w:bCs/>
+        </w:rPr>
+        <w:t xml:space="preserve">Leadership segment: </w:t>
+      </w:r>
+      <w:r>
+        <w:t xml:space="preserve">name the segment where leadership is realistic. The cleanest kind expands the pool — an unserved end with no incumbent to displace.</w:t>
+      </w:r>
+    </w:p>
+    <w:p>
+      <w:pPr>
+        <w:pStyle w:val="ListParagraph"/>
+        <w:numPr>
+          <w:ilvl w:val="0"/>
+          <w:numId w:val="11"/>
+        </w:numPr>
+        <w:spacing w:after="80"/>
+      </w:pPr>
+      <w:r>
+        <w:rPr>
+          <w:b/>
+          <w:bCs/>
+        </w:rPr>
+        <w:t xml:space="preserve">Path: </w:t>
+      </w:r>
+      <w:r>
+        <w:t xml:space="preserve">which structural advantages convert into leadership — cost position, differentiation, distribution? A me-too share is a FAIL.</w:t>
+      </w:r>
+    </w:p>
+    <w:p>
+      <w:pPr>
+        <w:pStyle w:val="ListParagraph"/>
+        <w:numPr>
+          <w:ilvl w:val="0"/>
+          <w:numId w:val="11"/>
+        </w:numPr>
+        <w:spacing w:after="80"/>
+      </w:pPr>
+      <w:r>
+        <w:rPr>
+          <w:b/>
+          <w:bCs/>
+        </w:rPr>
+        <w:t xml:space="preserve">Core effect: </w:t>
+      </w:r>
+      <w:r>
+        <w:t xml:space="preserve">does the move strengthen the core or tax it? Strengthening beats standalone economics.</w:t>
+      </w:r>
+    </w:p>
+    <w:p>
+      <w:pPr>
+        <w:pStyle w:val="ListParagraph"/>
+        <w:numPr>
+          <w:ilvl w:val="0"/>
+          <w:numId w:val="11"/>
         </w:numPr>
         <w:spacing w:after="80"/>
       </w:pPr>
@@ -7552,7 +8889,7 @@
         <w:pStyle w:val="ListParagraph"/>
         <w:numPr>
           <w:ilvl w:val="0"/>
-          <w:numId w:val="11"/>
+          <w:numId w:val="12"/>
         </w:numPr>
         <w:spacing w:after="80"/>
       </w:pPr>
@@ -7572,7 +8909,7 @@
         <w:pStyle w:val="ListParagraph"/>
         <w:numPr>
           <w:ilvl w:val="0"/>
-          <w:numId w:val="11"/>
+          <w:numId w:val="12"/>
         </w:numPr>
         <w:spacing w:after="80"/>
       </w:pPr>
@@ -7592,7 +8929,7 @@
         <w:pStyle w:val="ListParagraph"/>
         <w:numPr>
           <w:ilvl w:val="0"/>
-          <w:numId w:val="11"/>
+          <w:numId w:val="12"/>
         </w:numPr>
         <w:spacing w:after="80"/>
       </w:pPr>
@@ -8351,7 +9688,7 @@
         <w:pStyle w:val="ListParagraph"/>
         <w:numPr>
           <w:ilvl w:val="0"/>
-          <w:numId w:val="12"/>
+          <w:numId w:val="13"/>
         </w:numPr>
         <w:spacing w:after="80"/>
       </w:pPr>
@@ -8364,7 +9701,7 @@
         <w:pStyle w:val="ListParagraph"/>
         <w:numPr>
           <w:ilvl w:val="0"/>
-          <w:numId w:val="12"/>
+          <w:numId w:val="13"/>
         </w:numPr>
         <w:spacing w:after="80"/>
       </w:pPr>
@@ -8377,7 +9714,7 @@
         <w:pStyle w:val="ListParagraph"/>
         <w:numPr>
           <w:ilvl w:val="0"/>
-          <w:numId w:val="12"/>
+          <w:numId w:val="13"/>
         </w:numPr>
         <w:spacing w:after="80"/>
       </w:pPr>
@@ -8390,7 +9727,7 @@
         <w:pStyle w:val="ListParagraph"/>
         <w:numPr>
           <w:ilvl w:val="0"/>
-          <w:numId w:val="12"/>
+          <w:numId w:val="13"/>
         </w:numPr>
         <w:spacing w:after="80"/>
       </w:pPr>
@@ -8403,7 +9740,7 @@
         <w:pStyle w:val="ListParagraph"/>
         <w:numPr>
           <w:ilvl w:val="0"/>
-          <w:numId w:val="12"/>
+          <w:numId w:val="13"/>
         </w:numPr>
         <w:spacing w:after="80"/>
       </w:pPr>
@@ -9423,7 +10760,7 @@
         <w:spacing w:after="140" w:before="280"/>
       </w:pPr>
       <w:r>
-        <w:t xml:space="preserve">Step 11 — Final lint (A1-A12)</w:t>
+        <w:t xml:space="preserve">Step 11 — Final lint (A1-A13)</w:t>
       </w:r>
     </w:p>
     <w:p>
@@ -9504,7 +10841,7 @@
                 <w:sz w:val="20"/>
                 <w:szCs w:val="20"/>
               </w:rPr>
-              <w:t xml:space="preserve">Run lint rules A1-A12 on the analysis. Report each failure by rule number with the offending item quoted. Do not fix anything — report only.</w:t>
+              <w:t xml:space="preserve">Run lint rules A1-A13 on the analysis. Report each failure by rule number with the offending item quoted. Do not fix anything — report only.</w:t>
             </w:r>
           </w:p>
         </w:tc>
@@ -9529,7 +10866,7 @@
         <w:pStyle w:val="ListParagraph"/>
         <w:numPr>
           <w:ilvl w:val="0"/>
-          <w:numId w:val="13"/>
+          <w:numId w:val="14"/>
         </w:numPr>
         <w:spacing w:after="80"/>
       </w:pPr>
@@ -9549,7 +10886,7 @@
         <w:pStyle w:val="ListParagraph"/>
         <w:numPr>
           <w:ilvl w:val="0"/>
-          <w:numId w:val="13"/>
+          <w:numId w:val="14"/>
         </w:numPr>
         <w:spacing w:after="80"/>
       </w:pPr>
@@ -9569,7 +10906,7 @@
         <w:pStyle w:val="ListParagraph"/>
         <w:numPr>
           <w:ilvl w:val="0"/>
-          <w:numId w:val="13"/>
+          <w:numId w:val="14"/>
         </w:numPr>
         <w:spacing w:after="80"/>
       </w:pPr>
@@ -9589,7 +10926,7 @@
         <w:pStyle w:val="ListParagraph"/>
         <w:numPr>
           <w:ilvl w:val="0"/>
-          <w:numId w:val="13"/>
+          <w:numId w:val="14"/>
         </w:numPr>
         <w:spacing w:after="80"/>
       </w:pPr>
@@ -9609,7 +10946,7 @@
         <w:pStyle w:val="ListParagraph"/>
         <w:numPr>
           <w:ilvl w:val="0"/>
-          <w:numId w:val="13"/>
+          <w:numId w:val="14"/>
         </w:numPr>
         <w:spacing w:after="80"/>
       </w:pPr>
@@ -9629,7 +10966,7 @@
         <w:pStyle w:val="ListParagraph"/>
         <w:numPr>
           <w:ilvl w:val="0"/>
-          <w:numId w:val="13"/>
+          <w:numId w:val="14"/>
         </w:numPr>
         <w:spacing w:after="80"/>
       </w:pPr>
@@ -9649,7 +10986,7 @@
         <w:pStyle w:val="ListParagraph"/>
         <w:numPr>
           <w:ilvl w:val="0"/>
-          <w:numId w:val="13"/>
+          <w:numId w:val="14"/>
         </w:numPr>
         <w:spacing w:after="80"/>
       </w:pPr>
@@ -9669,7 +11006,7 @@
         <w:pStyle w:val="ListParagraph"/>
         <w:numPr>
           <w:ilvl w:val="0"/>
-          <w:numId w:val="13"/>
+          <w:numId w:val="14"/>
         </w:numPr>
         <w:spacing w:after="80"/>
       </w:pPr>
@@ -9689,7 +11026,7 @@
         <w:pStyle w:val="ListParagraph"/>
         <w:numPr>
           <w:ilvl w:val="0"/>
-          <w:numId w:val="13"/>
+          <w:numId w:val="14"/>
         </w:numPr>
         <w:spacing w:after="80"/>
       </w:pPr>
@@ -9709,7 +11046,7 @@
         <w:pStyle w:val="ListParagraph"/>
         <w:numPr>
           <w:ilvl w:val="0"/>
-          <w:numId w:val="13"/>
+          <w:numId w:val="14"/>
         </w:numPr>
         <w:spacing w:after="80"/>
       </w:pPr>
@@ -9729,7 +11066,7 @@
         <w:pStyle w:val="ListParagraph"/>
         <w:numPr>
           <w:ilvl w:val="0"/>
-          <w:numId w:val="13"/>
+          <w:numId w:val="14"/>
         </w:numPr>
         <w:spacing w:after="80"/>
       </w:pPr>
@@ -9749,7 +11086,7 @@
         <w:pStyle w:val="ListParagraph"/>
         <w:numPr>
           <w:ilvl w:val="0"/>
-          <w:numId w:val="13"/>
+          <w:numId w:val="14"/>
         </w:numPr>
         <w:spacing w:after="80"/>
       </w:pPr>
@@ -9762,6 +11099,26 @@
       </w:r>
       <w:r>
         <w:t xml:space="preserve">Any single figure that carries a decision alone without primary-source verification.</w:t>
+      </w:r>
+    </w:p>
+    <w:p>
+      <w:pPr>
+        <w:pStyle w:val="ListParagraph"/>
+        <w:numPr>
+          <w:ilvl w:val="0"/>
+          <w:numId w:val="14"/>
+        </w:numPr>
+        <w:spacing w:after="80"/>
+      </w:pPr>
+      <w:r>
+        <w:rPr>
+          <w:b/>
+          <w:bCs/>
+        </w:rPr>
+        <w:t xml:space="preserve">A13 — Unmeasured leadership. </w:t>
+      </w:r>
+      <w:r>
+        <w:t xml:space="preserve">A leadership verdict with no measured return spread and share stability for the market's current leaders; or a figure that could have been computed replaced by narrative instead of marked UNMEASURED.</w:t>
       </w:r>
     </w:p>
     <w:p>
@@ -10091,6 +11448,18 @@
     </w:lvl>
   </w:abstractNum>
   <w:abstractNum w:abstractNumId="13" w15:restartNumberingAfterBreak="0">
+    <w:multiLevelType w:val="hybridMultilevel"/>
+    <w:lvl w:ilvl="0" w15:tentative="1">
+      <w:start w:val="1"/>
+      <w:numFmt w:val="decimal"/>
+      <w:lvlText w:val="%1."/>
+      <w:lvlJc w:val="left"/>
+      <w:pPr>
+        <w:ind w:left="460" w:hanging="320"/>
+      </w:pPr>
+    </w:lvl>
+  </w:abstractNum>
+  <w:abstractNum w:abstractNumId="14" w15:restartNumberingAfterBreak="0">
     <w:multiLevelType w:val="hybridMultilevel"/>
     <w:lvl w:ilvl="0" w15:tentative="1">
       <w:start w:val="1"/>
@@ -10176,6 +11545,12 @@
   </w:num>
   <w:num w:numId="13">
     <w:abstractNumId w:val="13"/>
+    <w:lvlOverride w:ilvl="0">
+      <w:startOverride w:val="1"/>
+    </w:lvlOverride>
+  </w:num>
+  <w:num w:numId="14">
+    <w:abstractNumId w:val="14"/>
     <w:lvlOverride w:ilvl="0">
       <w:startOverride w:val="1"/>
     </w:lvlOverride>

</xml_diff>